<commit_message>
Submit srs group 6
</commit_message>
<xml_diff>
--- a/Software requirements specification/SRS v1.2_Group6.docx
+++ b/Software requirements specification/SRS v1.2_Group6.docx
@@ -2270,13 +2270,7 @@
         <w:rPr>
           <w:b/>
         </w:rPr>
-        <w:t xml:space="preserve"> </w:t>
-      </w:r>
-      <w:r>
-        <w:rPr>
-          <w:b/>
-        </w:rPr>
-        <w:t>Exclusions:</w:t>
+        <w:t xml:space="preserve"> Exclusions:</w:t>
       </w:r>
     </w:p>
     <w:p>
@@ -3366,10 +3360,7 @@
               <w:jc w:val="left"/>
             </w:pPr>
             <w:r>
-              <w:t>A</w:t>
-            </w:r>
-            <w:r>
-              <w:t xml:space="preserve"> temporary period of interaction or engagement between a user and a system, during which the user accesses and interacts with software or a website, and the system maintains relevant settings and information.</w:t>
+              <w:t>A temporary period of interaction or engagement between a user and a system, during which the user accesses and interacts with software or a website, and the system maintains relevant settings and information.</w:t>
             </w:r>
           </w:p>
         </w:tc>
@@ -3636,10 +3627,7 @@
               <w:jc w:val="left"/>
             </w:pPr>
             <w:r>
-              <w:t xml:space="preserve">A </w:t>
-            </w:r>
-            <w:r>
-              <w:t>payment card issued by a financial institution, such as a bank or credit union, that allows cardholders to borrow funds up to a predetermined limit to make purchases or pay for goods and services</w:t>
+              <w:t>A payment card issued by a financial institution, such as a bank or credit union, that allows cardholders to borrow funds up to a predetermined limit to make purchases or pay for goods and services</w:t>
             </w:r>
           </w:p>
         </w:tc>
@@ -4011,39 +3999,51 @@
       </w:pPr>
       <w:r>
         <w:rPr>
-          <w:i/>
           <w:noProof/>
         </w:rPr>
         <w:lastRenderedPageBreak/>
         <w:drawing>
-          <wp:inline distT="114300" distB="114300" distL="114300" distR="114300" wp14:anchorId="0C3DAA05" wp14:editId="34B02DE0">
-            <wp:extent cx="5486400" cy="5207000"/>
+          <wp:inline distT="0" distB="0" distL="0" distR="0" wp14:anchorId="1CEE76C8" wp14:editId="7DB868F8">
+            <wp:extent cx="5486400" cy="5208905"/>
             <wp:effectExtent l="0" t="0" r="0" b="0"/>
-            <wp:docPr id="5" name="image6.png"/>
-            <wp:cNvGraphicFramePr/>
+            <wp:docPr id="1097329111" name="Picture 4" descr="A diagram of a company&#10;&#10;AI-generated content may be incorrect."/>
+            <wp:cNvGraphicFramePr>
+              <a:graphicFrameLocks xmlns:a="http://schemas.openxmlformats.org/drawingml/2006/main" noChangeAspect="1"/>
+            </wp:cNvGraphicFramePr>
             <a:graphic xmlns:a="http://schemas.openxmlformats.org/drawingml/2006/main">
               <a:graphicData uri="http://schemas.openxmlformats.org/drawingml/2006/picture">
                 <pic:pic xmlns:pic="http://schemas.openxmlformats.org/drawingml/2006/picture">
                   <pic:nvPicPr>
-                    <pic:cNvPr id="0" name="image6.png"/>
-                    <pic:cNvPicPr preferRelativeResize="0"/>
+                    <pic:cNvPr id="1097329111" name="Picture 4" descr="A diagram of a company&#10;&#10;AI-generated content may be incorrect."/>
+                    <pic:cNvPicPr>
+                      <a:picLocks noChangeAspect="1" noChangeArrowheads="1"/>
+                    </pic:cNvPicPr>
                   </pic:nvPicPr>
                   <pic:blipFill>
-                    <a:blip r:embed="rId8"/>
+                    <a:blip r:embed="rId8" cstate="print">
+                      <a:extLst>
+                        <a:ext uri="{28A0092B-C50C-407E-A947-70E740481C1C}">
+                          <a14:useLocalDpi xmlns:a14="http://schemas.microsoft.com/office/drawing/2010/main" val="0"/>
+                        </a:ext>
+                      </a:extLst>
+                    </a:blip>
                     <a:srcRect/>
                     <a:stretch>
                       <a:fillRect/>
                     </a:stretch>
                   </pic:blipFill>
-                  <pic:spPr>
+                  <pic:spPr bwMode="auto">
                     <a:xfrm>
                       <a:off x="0" y="0"/>
-                      <a:ext cx="5486400" cy="5207000"/>
+                      <a:ext cx="5486400" cy="5208905"/>
                     </a:xfrm>
                     <a:prstGeom prst="rect">
                       <a:avLst/>
                     </a:prstGeom>
-                    <a:ln/>
+                    <a:noFill/>
+                    <a:ln>
+                      <a:noFill/>
+                    </a:ln>
                   </pic:spPr>
                 </pic:pic>
               </a:graphicData>
@@ -4114,14 +4114,7 @@
           <w:rFonts w:ascii="Arial" w:eastAsia="Arial" w:hAnsi="Arial" w:cs="Arial"/>
           <w:i/>
         </w:rPr>
-        <w:t>Business operation</w:t>
-      </w:r>
-      <w:r>
-        <w:rPr>
-          <w:rFonts w:ascii="Arial" w:eastAsia="Arial" w:hAnsi="Arial" w:cs="Arial"/>
-          <w:i/>
-        </w:rPr>
-        <w:t xml:space="preserve">- </w:t>
+        <w:t xml:space="preserve">Business operation- </w:t>
       </w:r>
       <w:r>
         <w:rPr>
@@ -4402,21 +4395,7 @@
           <w:rFonts w:ascii="Arial" w:eastAsia="Arial" w:hAnsi="Arial" w:cs="Arial"/>
           <w:i/>
         </w:rPr>
-        <w:t xml:space="preserve"> </w:t>
-      </w:r>
-      <w:r>
-        <w:rPr>
-          <w:rFonts w:ascii="Arial" w:eastAsia="Arial" w:hAnsi="Arial" w:cs="Arial"/>
-          <w:i/>
-        </w:rPr>
-        <w:t xml:space="preserve">Business operation- </w:t>
-      </w:r>
-      <w:r>
-        <w:rPr>
-          <w:rFonts w:ascii="Arial" w:eastAsia="Arial" w:hAnsi="Arial" w:cs="Arial"/>
-          <w:i/>
-        </w:rPr>
-        <w:t>Update Product</w:t>
+        <w:t xml:space="preserve"> Business operation- Update Product</w:t>
       </w:r>
     </w:p>
     <w:p>
@@ -4431,10 +4410,10 @@
           <w:noProof/>
         </w:rPr>
         <w:drawing>
-          <wp:inline distT="0" distB="0" distL="0" distR="0" wp14:anchorId="4D7481D9" wp14:editId="4E5B2EB7">
-            <wp:extent cx="5486400" cy="4386580"/>
-            <wp:effectExtent l="0" t="0" r="0" b="0"/>
-            <wp:docPr id="2046454286" name="Picture 3" descr="A diagram with yellow text&#10;&#10;AI-generated content may be incorrect."/>
+          <wp:inline distT="0" distB="0" distL="0" distR="0" wp14:anchorId="54FA358A" wp14:editId="1E0F5F82">
+            <wp:extent cx="5486400" cy="3293110"/>
+            <wp:effectExtent l="0" t="0" r="0" b="2540"/>
+            <wp:docPr id="1039151101" name="Picture 2" descr="Không có mô tả."/>
             <wp:cNvGraphicFramePr>
               <a:graphicFrameLocks xmlns:a="http://schemas.openxmlformats.org/drawingml/2006/main" noChangeAspect="1"/>
             </wp:cNvGraphicFramePr>
@@ -4442,7 +4421,7 @@
               <a:graphicData uri="http://schemas.openxmlformats.org/drawingml/2006/picture">
                 <pic:pic xmlns:pic="http://schemas.openxmlformats.org/drawingml/2006/picture">
                   <pic:nvPicPr>
-                    <pic:cNvPr id="2046454286" name="Picture 3" descr="A diagram with yellow text&#10;&#10;AI-generated content may be incorrect."/>
+                    <pic:cNvPr id="0" name="Picture 3" descr="Không có mô tả."/>
                     <pic:cNvPicPr>
                       <a:picLocks noChangeAspect="1" noChangeArrowheads="1"/>
                     </pic:cNvPicPr>
@@ -4463,7 +4442,7 @@
                   <pic:spPr bwMode="auto">
                     <a:xfrm>
                       <a:off x="0" y="0"/>
-                      <a:ext cx="5486400" cy="4386580"/>
+                      <a:ext cx="5486400" cy="3293110"/>
                     </a:xfrm>
                     <a:prstGeom prst="rect">
                       <a:avLst/>
@@ -4487,6 +4466,30 @@
           <w:i/>
         </w:rPr>
       </w:pPr>
+    </w:p>
+    <w:p>
+      <w:pPr>
+        <w:rPr>
+          <w:rFonts w:ascii="Arial" w:eastAsia="Arial" w:hAnsi="Arial" w:cs="Arial"/>
+          <w:i/>
+        </w:rPr>
+      </w:pPr>
+    </w:p>
+    <w:p>
+      <w:pPr>
+        <w:rPr>
+          <w:rFonts w:ascii="Arial" w:eastAsia="Arial" w:hAnsi="Arial" w:cs="Arial"/>
+          <w:i/>
+        </w:rPr>
+      </w:pPr>
+    </w:p>
+    <w:p>
+      <w:pPr>
+        <w:rPr>
+          <w:rFonts w:ascii="Arial" w:eastAsia="Arial" w:hAnsi="Arial" w:cs="Arial"/>
+          <w:i/>
+        </w:rPr>
+      </w:pPr>
       <w:r>
         <w:rPr>
           <w:rFonts w:ascii="Arial" w:eastAsia="Arial" w:hAnsi="Arial" w:cs="Arial"/>
@@ -4500,21 +4503,7 @@
           <w:rFonts w:ascii="Arial" w:eastAsia="Arial" w:hAnsi="Arial" w:cs="Arial"/>
           <w:i/>
         </w:rPr>
-        <w:t xml:space="preserve"> </w:t>
-      </w:r>
-      <w:r>
-        <w:rPr>
-          <w:rFonts w:ascii="Arial" w:eastAsia="Arial" w:hAnsi="Arial" w:cs="Arial"/>
-          <w:i/>
-        </w:rPr>
-        <w:t xml:space="preserve">Business operation- </w:t>
-      </w:r>
-      <w:r>
-        <w:rPr>
-          <w:rFonts w:ascii="Arial" w:eastAsia="Arial" w:hAnsi="Arial" w:cs="Arial"/>
-          <w:i/>
-        </w:rPr>
-        <w:t>Place Order</w:t>
+        <w:t xml:space="preserve"> Business operation- Place Order</w:t>
       </w:r>
     </w:p>
     <w:p>
@@ -4642,21 +4631,7 @@
           <w:rFonts w:ascii="Arial" w:eastAsia="Arial" w:hAnsi="Arial" w:cs="Arial"/>
           <w:i/>
         </w:rPr>
-        <w:t xml:space="preserve"> </w:t>
-      </w:r>
-      <w:r>
-        <w:rPr>
-          <w:rFonts w:ascii="Arial" w:eastAsia="Arial" w:hAnsi="Arial" w:cs="Arial"/>
-          <w:i/>
-        </w:rPr>
-        <w:t xml:space="preserve">Business operation- </w:t>
-      </w:r>
-      <w:r>
-        <w:rPr>
-          <w:rFonts w:ascii="Arial" w:eastAsia="Arial" w:hAnsi="Arial" w:cs="Arial"/>
-          <w:i/>
-        </w:rPr>
-        <w:t>Place Rush Order</w:t>
+        <w:t xml:space="preserve"> Business operation- Place Rush Order</w:t>
       </w:r>
     </w:p>
     <w:p>
@@ -4800,21 +4775,7 @@
           <w:rFonts w:ascii="Arial" w:eastAsia="Arial" w:hAnsi="Arial" w:cs="Arial"/>
           <w:i/>
         </w:rPr>
-        <w:t xml:space="preserve"> </w:t>
-      </w:r>
-      <w:r>
-        <w:rPr>
-          <w:rFonts w:ascii="Arial" w:eastAsia="Arial" w:hAnsi="Arial" w:cs="Arial"/>
-          <w:i/>
-        </w:rPr>
-        <w:t xml:space="preserve">Business operation- </w:t>
-      </w:r>
-      <w:r>
-        <w:rPr>
-          <w:rFonts w:ascii="Arial" w:eastAsia="Arial" w:hAnsi="Arial" w:cs="Arial"/>
-          <w:i/>
-        </w:rPr>
-        <w:t>Cancel Order</w:t>
+        <w:t xml:space="preserve"> Business operation- Cancel Order</w:t>
       </w:r>
     </w:p>
     <w:p>
@@ -4990,21 +4951,7 @@
           <w:rFonts w:ascii="Arial" w:eastAsia="Arial" w:hAnsi="Arial" w:cs="Arial"/>
           <w:i/>
         </w:rPr>
-        <w:t xml:space="preserve"> </w:t>
-      </w:r>
-      <w:r>
-        <w:rPr>
-          <w:rFonts w:ascii="Arial" w:eastAsia="Arial" w:hAnsi="Arial" w:cs="Arial"/>
-          <w:i/>
-        </w:rPr>
-        <w:t xml:space="preserve">Business operation- </w:t>
-      </w:r>
-      <w:r>
-        <w:rPr>
-          <w:rFonts w:ascii="Arial" w:eastAsia="Arial" w:hAnsi="Arial" w:cs="Arial"/>
-          <w:i/>
-        </w:rPr>
-        <w:t>Add product to Cart</w:t>
+        <w:t xml:space="preserve"> Business operation- Add product to Cart</w:t>
       </w:r>
     </w:p>
     <w:p>
@@ -5087,21 +5034,7 @@
           <w:rFonts w:ascii="Arial" w:eastAsia="Arial" w:hAnsi="Arial" w:cs="Arial"/>
           <w:i/>
         </w:rPr>
-        <w:t xml:space="preserve"> </w:t>
-      </w:r>
-      <w:r>
-        <w:rPr>
-          <w:rFonts w:ascii="Arial" w:eastAsia="Arial" w:hAnsi="Arial" w:cs="Arial"/>
-          <w:i/>
-        </w:rPr>
-        <w:t xml:space="preserve">Business operation- </w:t>
-      </w:r>
-      <w:r>
-        <w:rPr>
-          <w:rFonts w:ascii="Arial" w:eastAsia="Arial" w:hAnsi="Arial" w:cs="Arial"/>
-          <w:i/>
-        </w:rPr>
-        <w:t>View Cart</w:t>
+        <w:t xml:space="preserve"> Business operation- View Cart</w:t>
       </w:r>
     </w:p>
     <w:p>
@@ -5209,21 +5142,7 @@
           <w:rFonts w:ascii="Arial" w:eastAsia="Arial" w:hAnsi="Arial" w:cs="Arial"/>
           <w:i/>
         </w:rPr>
-        <w:t xml:space="preserve"> </w:t>
-      </w:r>
-      <w:r>
-        <w:rPr>
-          <w:rFonts w:ascii="Arial" w:eastAsia="Arial" w:hAnsi="Arial" w:cs="Arial"/>
-          <w:i/>
-        </w:rPr>
-        <w:t xml:space="preserve">Business operation- </w:t>
-      </w:r>
-      <w:r>
-        <w:rPr>
-          <w:rFonts w:ascii="Arial" w:eastAsia="Arial" w:hAnsi="Arial" w:cs="Arial"/>
-          <w:i/>
-        </w:rPr>
-        <w:t>Update Cart</w:t>
+        <w:t xml:space="preserve"> Business operation- Update Cart</w:t>
       </w:r>
     </w:p>
     <w:p>
@@ -5238,10 +5157,10 @@
           <w:noProof/>
         </w:rPr>
         <w:drawing>
-          <wp:inline distT="0" distB="0" distL="0" distR="0" wp14:anchorId="151086B4" wp14:editId="38173819">
-            <wp:extent cx="5486400" cy="5033645"/>
+          <wp:inline distT="0" distB="0" distL="0" distR="0" wp14:anchorId="2FB42010" wp14:editId="7356ABE1">
+            <wp:extent cx="5486400" cy="5374005"/>
             <wp:effectExtent l="0" t="0" r="0" b="0"/>
-            <wp:docPr id="628527214" name="Picture 6" descr="A screenshot of a computer&#10;&#10;AI-generated content may be incorrect."/>
+            <wp:docPr id="588525804" name="Picture 3" descr="A screenshot of a diagram&#10;&#10;AI-generated content may be incorrect."/>
             <wp:cNvGraphicFramePr>
               <a:graphicFrameLocks xmlns:a="http://schemas.openxmlformats.org/drawingml/2006/main" noChangeAspect="1"/>
             </wp:cNvGraphicFramePr>
@@ -5249,7 +5168,7 @@
               <a:graphicData uri="http://schemas.openxmlformats.org/drawingml/2006/picture">
                 <pic:pic xmlns:pic="http://schemas.openxmlformats.org/drawingml/2006/picture">
                   <pic:nvPicPr>
-                    <pic:cNvPr id="628527214" name="Picture 6" descr="A screenshot of a computer&#10;&#10;AI-generated content may be incorrect."/>
+                    <pic:cNvPr id="588525804" name="Picture 3" descr="A screenshot of a diagram&#10;&#10;AI-generated content may be incorrect."/>
                     <pic:cNvPicPr>
                       <a:picLocks noChangeAspect="1" noChangeArrowheads="1"/>
                     </pic:cNvPicPr>
@@ -5270,7 +5189,7 @@
                   <pic:spPr bwMode="auto">
                     <a:xfrm>
                       <a:off x="0" y="0"/>
-                      <a:ext cx="5486400" cy="5033645"/>
+                      <a:ext cx="5486400" cy="5374005"/>
                     </a:xfrm>
                     <a:prstGeom prst="rect">
                       <a:avLst/>
@@ -5379,7 +5298,6 @@
           <w:rFonts w:ascii="Arial" w:eastAsia="Arial" w:hAnsi="Arial" w:cs="Arial"/>
           <w:i/>
         </w:rPr>
-        <w:lastRenderedPageBreak/>
         <w:t>2.3.11</w:t>
       </w:r>
       <w:r>
@@ -5387,21 +5305,7 @@
           <w:rFonts w:ascii="Arial" w:eastAsia="Arial" w:hAnsi="Arial" w:cs="Arial"/>
           <w:i/>
         </w:rPr>
-        <w:t xml:space="preserve"> </w:t>
-      </w:r>
-      <w:r>
-        <w:rPr>
-          <w:rFonts w:ascii="Arial" w:eastAsia="Arial" w:hAnsi="Arial" w:cs="Arial"/>
-          <w:i/>
-        </w:rPr>
-        <w:t xml:space="preserve">Business operation- </w:t>
-      </w:r>
-      <w:r>
-        <w:rPr>
-          <w:rFonts w:ascii="Arial" w:eastAsia="Arial" w:hAnsi="Arial" w:cs="Arial"/>
-          <w:i/>
-        </w:rPr>
-        <w:t>Process Pending Order</w:t>
+        <w:t xml:space="preserve"> Business operation- Process Pending Order</w:t>
       </w:r>
     </w:p>
     <w:p>
@@ -5553,7 +5457,6 @@
           <w:rFonts w:ascii="Arial" w:eastAsia="Arial" w:hAnsi="Arial" w:cs="Arial"/>
           <w:i/>
         </w:rPr>
-        <w:lastRenderedPageBreak/>
         <w:t>2.3.12</w:t>
       </w:r>
       <w:r>
@@ -5561,21 +5464,7 @@
           <w:rFonts w:ascii="Arial" w:eastAsia="Arial" w:hAnsi="Arial" w:cs="Arial"/>
           <w:i/>
         </w:rPr>
-        <w:t xml:space="preserve"> </w:t>
-      </w:r>
-      <w:r>
-        <w:rPr>
-          <w:rFonts w:ascii="Arial" w:eastAsia="Arial" w:hAnsi="Arial" w:cs="Arial"/>
-          <w:i/>
-        </w:rPr>
-        <w:t xml:space="preserve">Business operation- </w:t>
-      </w:r>
-      <w:r>
-        <w:rPr>
-          <w:rFonts w:ascii="Arial" w:eastAsia="Arial" w:hAnsi="Arial" w:cs="Arial"/>
-          <w:i/>
-        </w:rPr>
-        <w:t>Search Product</w:t>
+        <w:t xml:space="preserve"> Business operation- Search Product</w:t>
       </w:r>
     </w:p>
     <w:p>
@@ -5590,10 +5479,10 @@
           <w:noProof/>
         </w:rPr>
         <w:drawing>
-          <wp:inline distT="0" distB="0" distL="0" distR="0" wp14:anchorId="15E3DAEC" wp14:editId="38BDB3C7">
-            <wp:extent cx="5486400" cy="3600450"/>
+          <wp:inline distT="0" distB="0" distL="0" distR="0" wp14:anchorId="1B76E08D" wp14:editId="536789E9">
+            <wp:extent cx="5486400" cy="3601085"/>
             <wp:effectExtent l="0" t="0" r="0" b="0"/>
-            <wp:docPr id="1213969005" name="Picture 7" descr="A diagram with text and words&#10;&#10;AI-generated content may be incorrect."/>
+            <wp:docPr id="1894079852" name="Picture 1" descr="A diagram with text and words&#10;&#10;AI-generated content may be incorrect."/>
             <wp:cNvGraphicFramePr>
               <a:graphicFrameLocks xmlns:a="http://schemas.openxmlformats.org/drawingml/2006/main" noChangeAspect="1"/>
             </wp:cNvGraphicFramePr>
@@ -5601,7 +5490,7 @@
               <a:graphicData uri="http://schemas.openxmlformats.org/drawingml/2006/picture">
                 <pic:pic xmlns:pic="http://schemas.openxmlformats.org/drawingml/2006/picture">
                   <pic:nvPicPr>
-                    <pic:cNvPr id="1213969005" name="Picture 7" descr="A diagram with text and words&#10;&#10;AI-generated content may be incorrect."/>
+                    <pic:cNvPr id="1894079852" name="Picture 1" descr="A diagram with text and words&#10;&#10;AI-generated content may be incorrect."/>
                     <pic:cNvPicPr>
                       <a:picLocks noChangeAspect="1" noChangeArrowheads="1"/>
                     </pic:cNvPicPr>
@@ -5622,7 +5511,7 @@
                   <pic:spPr bwMode="auto">
                     <a:xfrm>
                       <a:off x="0" y="0"/>
-                      <a:ext cx="5486400" cy="3600450"/>
+                      <a:ext cx="5486400" cy="3601085"/>
                     </a:xfrm>
                     <a:prstGeom prst="rect">
                       <a:avLst/>
@@ -5771,7 +5660,6 @@
           <w:rFonts w:ascii="Arial" w:eastAsia="Arial" w:hAnsi="Arial" w:cs="Arial"/>
           <w:i/>
         </w:rPr>
-        <w:lastRenderedPageBreak/>
         <w:t>2.3.13</w:t>
       </w:r>
       <w:r>
@@ -5779,21 +5667,7 @@
           <w:rFonts w:ascii="Arial" w:eastAsia="Arial" w:hAnsi="Arial" w:cs="Arial"/>
           <w:i/>
         </w:rPr>
-        <w:t xml:space="preserve"> </w:t>
-      </w:r>
-      <w:r>
-        <w:rPr>
-          <w:rFonts w:ascii="Arial" w:eastAsia="Arial" w:hAnsi="Arial" w:cs="Arial"/>
-          <w:i/>
-        </w:rPr>
-        <w:t xml:space="preserve">Business operation- </w:t>
-      </w:r>
-      <w:r>
-        <w:rPr>
-          <w:rFonts w:ascii="Arial" w:eastAsia="Arial" w:hAnsi="Arial" w:cs="Arial"/>
-          <w:i/>
-        </w:rPr>
-        <w:t>Create User</w:t>
+        <w:t xml:space="preserve"> Business operation- Create User</w:t>
       </w:r>
     </w:p>
     <w:p>
@@ -5957,29 +5831,14 @@
           <w:rFonts w:ascii="Arial" w:eastAsia="Arial" w:hAnsi="Arial" w:cs="Arial"/>
           <w:i/>
         </w:rPr>
-        <w:lastRenderedPageBreak/>
-        <w:t>2.3.14</w:t>
+        <w:t xml:space="preserve">2.3.14 </w:t>
       </w:r>
       <w:r>
         <w:rPr>
           <w:rFonts w:ascii="Arial" w:eastAsia="Arial" w:hAnsi="Arial" w:cs="Arial"/>
           <w:i/>
         </w:rPr>
-        <w:t xml:space="preserve"> </w:t>
-      </w:r>
-      <w:r>
-        <w:rPr>
-          <w:rFonts w:ascii="Arial" w:eastAsia="Arial" w:hAnsi="Arial" w:cs="Arial"/>
-          <w:i/>
-        </w:rPr>
-        <w:t xml:space="preserve">Business operation- </w:t>
-      </w:r>
-      <w:r>
-        <w:rPr>
-          <w:rFonts w:ascii="Arial" w:eastAsia="Arial" w:hAnsi="Arial" w:cs="Arial"/>
-          <w:i/>
-        </w:rPr>
-        <w:t>Update User Information</w:t>
+        <w:t>Business operation- Update User Information</w:t>
       </w:r>
     </w:p>
     <w:p>
@@ -6107,13 +5966,6 @@
     </w:p>
     <w:p>
       <w:pPr>
-        <w:rPr>
-          <w:i/>
-        </w:rPr>
-      </w:pPr>
-    </w:p>
-    <w:p>
-      <w:pPr>
         <w:pStyle w:val="Heading1"/>
         <w:numPr>
           <w:ilvl w:val="0"/>
@@ -17352,14 +17204,7 @@
                       <w:sz w:val="20"/>
                       <w:szCs w:val="20"/>
                     </w:rPr>
-                    <w:t>2</w:t>
-                  </w:r>
-                  <w:r>
-                    <w:rPr>
-                      <w:sz w:val="20"/>
-                      <w:szCs w:val="20"/>
-                    </w:rPr>
-                    <w:t>.</w:t>
+                    <w:t>2.</w:t>
                   </w:r>
                 </w:p>
               </w:tc>
@@ -19510,14 +19355,7 @@
                       <w:sz w:val="20"/>
                       <w:szCs w:val="20"/>
                     </w:rPr>
-                    <w:t xml:space="preserve">  </w:t>
-                  </w:r>
-                  <w:r>
-                    <w:rPr>
-                      <w:sz w:val="20"/>
-                      <w:szCs w:val="20"/>
-                    </w:rPr>
-                    <w:t>At Step 6</w:t>
+                    <w:t xml:space="preserve">  At Step 6</w:t>
                   </w:r>
                 </w:p>
               </w:tc>
@@ -29156,33 +28994,6 @@
                 <w:ilvl w:val="0"/>
                 <w:numId w:val="58"/>
               </w:numPr>
-              <w:tabs>
-                <w:tab w:val="right" w:pos="992"/>
-                <w:tab w:val="center" w:pos="1125"/>
-                <w:tab w:val="left" w:pos="1125"/>
-                <w:tab w:val="right" w:pos="992"/>
-              </w:tabs>
-              <w:spacing w:before="0"/>
-              <w:jc w:val="left"/>
-              <w:rPr>
-                <w:sz w:val="26"/>
-                <w:szCs w:val="26"/>
-              </w:rPr>
-            </w:pPr>
-            <w:r>
-              <w:rPr>
-                <w:sz w:val="26"/>
-                <w:szCs w:val="26"/>
-              </w:rPr>
-              <w:t>The software updates the quantity of the inventory.</w:t>
-            </w:r>
-          </w:p>
-          <w:p>
-            <w:pPr>
-              <w:numPr>
-                <w:ilvl w:val="0"/>
-                <w:numId w:val="58"/>
-              </w:numPr>
               <w:spacing w:before="0"/>
               <w:rPr>
                 <w:sz w:val="22"/>
@@ -29447,15 +29258,7 @@
                       <w:sz w:val="20"/>
                       <w:szCs w:val="20"/>
                     </w:rPr>
-                    <w:t xml:space="preserve">Customer attempts to update a product quantity that exceeds </w:t>
-                  </w:r>
-                  <w:r>
-                    <w:rPr>
-                      <w:sz w:val="20"/>
-                      <w:szCs w:val="20"/>
-                    </w:rPr>
-                    <w:lastRenderedPageBreak/>
-                    <w:t>available inventory</w:t>
+                    <w:t>Customer attempts to update a product quantity that exceeds available inventory</w:t>
                   </w:r>
                 </w:p>
               </w:tc>
@@ -29477,7 +29280,6 @@
                       <w:sz w:val="20"/>
                       <w:szCs w:val="20"/>
                     </w:rPr>
-                    <w:lastRenderedPageBreak/>
                     <w:t>Display a message indicating the maximum available quantity. Customer can adjust the quantity or cancel the action.</w:t>
                   </w:r>
                 </w:p>
@@ -29524,6 +29326,7 @@
                       <w:sz w:val="20"/>
                       <w:szCs w:val="20"/>
                     </w:rPr>
+                    <w:lastRenderedPageBreak/>
                     <w:t>2</w:t>
                   </w:r>
                   <w:r>
@@ -29551,7 +29354,14 @@
                       <w:sz w:val="20"/>
                       <w:szCs w:val="20"/>
                     </w:rPr>
-                    <w:t>Step 4</w:t>
+                    <w:t xml:space="preserve">Step </w:t>
+                  </w:r>
+                  <w:r>
+                    <w:rPr>
+                      <w:sz w:val="20"/>
+                      <w:szCs w:val="20"/>
+                    </w:rPr>
+                    <w:t>3</w:t>
                   </w:r>
                 </w:p>
               </w:tc>
@@ -29614,7 +29424,14 @@
                       <w:sz w:val="20"/>
                       <w:szCs w:val="20"/>
                     </w:rPr>
-                    <w:t>Step 4</w:t>
+                    <w:t xml:space="preserve">Step </w:t>
+                  </w:r>
+                  <w:r>
+                    <w:rPr>
+                      <w:sz w:val="20"/>
+                      <w:szCs w:val="20"/>
+                    </w:rPr>
+                    <w:t>3</w:t>
                   </w:r>
                 </w:p>
               </w:tc>
@@ -30309,7 +30126,6 @@
               <w:spacing w:before="0"/>
             </w:pPr>
             <w:r>
-              <w:lastRenderedPageBreak/>
               <w:t>The software displays up to 30 pending orders per page</w:t>
             </w:r>
           </w:p>
@@ -30346,6 +30162,7 @@
               <w:spacing w:before="0"/>
             </w:pPr>
             <w:r>
+              <w:lastRenderedPageBreak/>
               <w:t>The software validates current inventory availability</w:t>
             </w:r>
           </w:p>
@@ -31040,7 +30857,6 @@
                 <w:sz w:val="14"/>
                 <w:szCs w:val="14"/>
               </w:rPr>
-              <w:lastRenderedPageBreak/>
               <w:t xml:space="preserve"> </w:t>
             </w:r>
             <w:r>
@@ -31064,6 +30880,7 @@
               <w:rPr>
                 <w:b/>
               </w:rPr>
+              <w:lastRenderedPageBreak/>
               <w:t>Table A-Input data of  Process Pending Order</w:t>
             </w:r>
           </w:p>
@@ -35587,7 +35404,7 @@
       <w:bookmarkStart w:id="29" w:name="_ac0xmlhmdb4c" w:colFirst="0" w:colLast="0"/>
       <w:bookmarkEnd w:id="29"/>
       <w:r>
-        <w:t xml:space="preserve">Update User Information </w:t>
+        <w:t xml:space="preserve">Update User </w:t>
       </w:r>
     </w:p>
     <w:tbl>
@@ -35628,7 +35445,23 @@
                 <w:sz w:val="32"/>
                 <w:szCs w:val="32"/>
               </w:rPr>
-              <w:t>Use Case “Update User Information”</w:t>
+              <w:t>Use Case “Update Us</w:t>
+            </w:r>
+            <w:r>
+              <w:rPr>
+                <w:b/>
+                <w:sz w:val="32"/>
+                <w:szCs w:val="32"/>
+              </w:rPr>
+              <w:t>er</w:t>
+            </w:r>
+            <w:r>
+              <w:rPr>
+                <w:b/>
+                <w:sz w:val="32"/>
+                <w:szCs w:val="32"/>
+              </w:rPr>
+              <w:t>”</w:t>
             </w:r>
           </w:p>
           <w:p>
@@ -35923,7 +35756,7 @@
               <w:rPr>
                 <w:b/>
               </w:rPr>
-              <w:t>Table N-Alternative flows of events for UC Update User Information</w:t>
+              <w:t xml:space="preserve">Table N-Alternative flows of events for UC Update User </w:t>
             </w:r>
           </w:p>
           <w:tbl>
@@ -36349,7 +36182,7 @@
               <w:rPr>
                 <w:b/>
               </w:rPr>
-              <w:t>Table A-Input data of Update User Information</w:t>
+              <w:t xml:space="preserve">Table A-Input data of Update User </w:t>
             </w:r>
           </w:p>
           <w:tbl>
@@ -44972,6 +44805,7 @@
   <w:style w:type="character" w:default="1" w:styleId="DefaultParagraphFont">
     <w:name w:val="Default Paragraph Font"/>
     <w:uiPriority w:val="1"/>
+    <w:semiHidden/>
     <w:unhideWhenUsed/>
   </w:style>
   <w:style w:type="table" w:default="1" w:styleId="TableNormal">

</xml_diff>

<commit_message>
Fix some bugs in SRS
</commit_message>
<xml_diff>
--- a/Software requirements specification/SRS v1.2_Group6.docx
+++ b/Software requirements specification/SRS v1.2_Group6.docx
@@ -4967,10 +4967,10 @@
           <w:noProof/>
         </w:rPr>
         <w:drawing>
-          <wp:inline distT="0" distB="0" distL="0" distR="0" wp14:anchorId="0F4687B6" wp14:editId="216BE566">
-            <wp:extent cx="5486400" cy="4398010"/>
-            <wp:effectExtent l="0" t="0" r="0" b="2540"/>
-            <wp:docPr id="520769108" name="Picture 4" descr="A diagram with text and images&#10;&#10;AI-generated content may be incorrect."/>
+          <wp:inline distT="0" distB="0" distL="0" distR="0" wp14:anchorId="1D5E4A95" wp14:editId="76CCDA8F">
+            <wp:extent cx="5486400" cy="4887595"/>
+            <wp:effectExtent l="0" t="0" r="0" b="8255"/>
+            <wp:docPr id="829141874" name="Picture 2" descr="A screenshot of a computer&#10;&#10;AI-generated content may be incorrect."/>
             <wp:cNvGraphicFramePr>
               <a:graphicFrameLocks xmlns:a="http://schemas.openxmlformats.org/drawingml/2006/main" noChangeAspect="1"/>
             </wp:cNvGraphicFramePr>
@@ -4978,7 +4978,7 @@
               <a:graphicData uri="http://schemas.openxmlformats.org/drawingml/2006/picture">
                 <pic:pic xmlns:pic="http://schemas.openxmlformats.org/drawingml/2006/picture">
                   <pic:nvPicPr>
-                    <pic:cNvPr id="520769108" name="Picture 4" descr="A diagram with text and images&#10;&#10;AI-generated content may be incorrect."/>
+                    <pic:cNvPr id="829141874" name="Picture 2" descr="A screenshot of a computer&#10;&#10;AI-generated content may be incorrect."/>
                     <pic:cNvPicPr>
                       <a:picLocks noChangeAspect="1" noChangeArrowheads="1"/>
                     </pic:cNvPicPr>
@@ -4999,7 +4999,7 @@
                   <pic:spPr bwMode="auto">
                     <a:xfrm>
                       <a:off x="0" y="0"/>
-                      <a:ext cx="5486400" cy="4398010"/>
+                      <a:ext cx="5486400" cy="4887595"/>
                     </a:xfrm>
                     <a:prstGeom prst="rect">
                       <a:avLst/>
@@ -5135,7 +5135,6 @@
           <w:rFonts w:ascii="Arial" w:eastAsia="Arial" w:hAnsi="Arial" w:cs="Arial"/>
           <w:i/>
         </w:rPr>
-        <w:lastRenderedPageBreak/>
         <w:t>2.3.10</w:t>
       </w:r>
       <w:r>
@@ -5158,10 +5157,10 @@
           <w:noProof/>
         </w:rPr>
         <w:drawing>
-          <wp:inline distT="0" distB="0" distL="0" distR="0" wp14:anchorId="2FB42010" wp14:editId="7356ABE1">
-            <wp:extent cx="5486400" cy="5374005"/>
+          <wp:inline distT="0" distB="0" distL="0" distR="0" wp14:anchorId="25D7234C" wp14:editId="29946972">
+            <wp:extent cx="5486400" cy="5240655"/>
             <wp:effectExtent l="0" t="0" r="0" b="0"/>
-            <wp:docPr id="588525804" name="Picture 3" descr="A screenshot of a diagram&#10;&#10;AI-generated content may be incorrect."/>
+            <wp:docPr id="2049482793" name="Picture 1" descr="A screenshot of a computer&#10;&#10;AI-generated content may be incorrect."/>
             <wp:cNvGraphicFramePr>
               <a:graphicFrameLocks xmlns:a="http://schemas.openxmlformats.org/drawingml/2006/main" noChangeAspect="1"/>
             </wp:cNvGraphicFramePr>
@@ -5169,7 +5168,7 @@
               <a:graphicData uri="http://schemas.openxmlformats.org/drawingml/2006/picture">
                 <pic:pic xmlns:pic="http://schemas.openxmlformats.org/drawingml/2006/picture">
                   <pic:nvPicPr>
-                    <pic:cNvPr id="588525804" name="Picture 3" descr="A screenshot of a diagram&#10;&#10;AI-generated content may be incorrect."/>
+                    <pic:cNvPr id="2049482793" name="Picture 1" descr="A screenshot of a computer&#10;&#10;AI-generated content may be incorrect."/>
                     <pic:cNvPicPr>
                       <a:picLocks noChangeAspect="1" noChangeArrowheads="1"/>
                     </pic:cNvPicPr>
@@ -5190,7 +5189,7 @@
                   <pic:spPr bwMode="auto">
                     <a:xfrm>
                       <a:off x="0" y="0"/>
-                      <a:ext cx="5486400" cy="5374005"/>
+                      <a:ext cx="5486400" cy="5240655"/>
                     </a:xfrm>
                     <a:prstGeom prst="rect">
                       <a:avLst/>
@@ -5283,7 +5282,6 @@
           <w:rFonts w:ascii="Arial" w:eastAsia="Arial" w:hAnsi="Arial" w:cs="Arial"/>
           <w:i/>
         </w:rPr>
-        <w:lastRenderedPageBreak/>
         <w:t>2.3.11</w:t>
       </w:r>
       <w:r>
@@ -5443,7 +5441,6 @@
           <w:rFonts w:ascii="Arial" w:eastAsia="Arial" w:hAnsi="Arial" w:cs="Arial"/>
           <w:i/>
         </w:rPr>
-        <w:lastRenderedPageBreak/>
         <w:t>2.3.12</w:t>
       </w:r>
       <w:r>
@@ -5647,7 +5644,6 @@
           <w:rFonts w:ascii="Arial" w:eastAsia="Arial" w:hAnsi="Arial" w:cs="Arial"/>
           <w:i/>
         </w:rPr>
-        <w:lastRenderedPageBreak/>
         <w:t>2.3.13</w:t>
       </w:r>
       <w:r>
@@ -5819,7 +5815,6 @@
           <w:rFonts w:ascii="Arial" w:eastAsia="Arial" w:hAnsi="Arial" w:cs="Arial"/>
           <w:i/>
         </w:rPr>
-        <w:lastRenderedPageBreak/>
         <w:t xml:space="preserve">2.3.14 </w:t>
       </w:r>
       <w:r>
@@ -6473,7 +6468,14 @@
                 <w:b/>
                 <w:color w:val="000000"/>
               </w:rPr>
-              <w:t>Table -Alternative flows of events for UC Place order</w:t>
+              <w:t>Table -Alternative flows of events for UC P</w:t>
+            </w:r>
+            <w:r>
+              <w:rPr>
+                <w:b/>
+                <w:color w:val="000000"/>
+              </w:rPr>
+              <w:t>ay Order</w:t>
             </w:r>
           </w:p>
           <w:tbl>
@@ -8764,15 +8766,9 @@
             <w:pPr>
               <w:spacing w:before="0"/>
               <w:ind w:left="720"/>
-              <w:rPr>
-                <w:b/>
-              </w:rPr>
             </w:pPr>
             <w:r>
-              <w:rPr>
-                <w:b/>
-              </w:rPr>
-              <w:t>None</w:t>
+              <w:t>The customer has navigated to the product list or product detail screen.</w:t>
             </w:r>
           </w:p>
           <w:p>
@@ -12783,14 +12779,14 @@
               <w:spacing w:before="0" w:line="240" w:lineRule="auto"/>
               <w:ind w:left="720"/>
               <w:rPr>
-                <w:b/>
+                <w:bCs/>
               </w:rPr>
             </w:pPr>
             <w:r>
               <w:rPr>
-                <w:b/>
-              </w:rPr>
-              <w:t>None</w:t>
+                <w:bCs/>
+              </w:rPr>
+              <w:t>The software displays the information of product.</w:t>
             </w:r>
           </w:p>
         </w:tc>
@@ -21531,7 +21527,7 @@
                 <w:sz w:val="32"/>
                 <w:szCs w:val="32"/>
               </w:rPr>
-              <w:t>Use Case “Place Rush Order ”</w:t>
+              <w:t>Use Case “Place Rush Order”</w:t>
             </w:r>
           </w:p>
           <w:p>
@@ -26592,6 +26588,7 @@
                 </w:tcPr>
                 <w:p>
                   <w:pPr>
+                    <w:jc w:val="left"/>
                     <w:rPr>
                       <w:sz w:val="20"/>
                       <w:szCs w:val="20"/>
@@ -27564,7 +27561,7 @@
               <w:ind w:left="1417"/>
             </w:pPr>
             <w:r>
-              <w:t xml:space="preserve"> The customer selects a product from the product list.</w:t>
+              <w:t>The customer selects a product from the product list.</w:t>
             </w:r>
           </w:p>
           <w:p>
@@ -27576,7 +27573,7 @@
               <w:spacing w:before="0"/>
             </w:pPr>
             <w:r>
-              <w:t xml:space="preserve"> The customer specifies the quantity and adds the product to the cart. </w:t>
+              <w:t xml:space="preserve">The customer specifies the quantity and adds the product to the cart. </w:t>
             </w:r>
           </w:p>
           <w:p>
@@ -27588,7 +27585,19 @@
               <w:spacing w:before="0"/>
             </w:pPr>
             <w:r>
-              <w:t xml:space="preserve"> The software updates the cart with the selected product and its quantity. </w:t>
+              <w:t>The software check</w:t>
+            </w:r>
+            <w:r>
+              <w:t>s</w:t>
+            </w:r>
+            <w:r>
+              <w:t xml:space="preserve"> the inventory of product</w:t>
+            </w:r>
+            <w:r>
+              <w:t>.</w:t>
+            </w:r>
+            <w:r>
+              <w:t xml:space="preserve">. </w:t>
             </w:r>
           </w:p>
           <w:p>
@@ -27600,7 +27609,19 @@
               <w:spacing w:before="0"/>
             </w:pPr>
             <w:r>
-              <w:t>The software displays the updated cart with the total price excluding VAT.</w:t>
+              <w:t>The software displays the updated cart with</w:t>
+            </w:r>
+            <w:r>
+              <w:t xml:space="preserve"> the selected product, its quantity</w:t>
+            </w:r>
+            <w:r>
+              <w:t xml:space="preserve"> </w:t>
+            </w:r>
+            <w:r>
+              <w:t xml:space="preserve">and </w:t>
+            </w:r>
+            <w:r>
+              <w:t>the total price excluding VAT.</w:t>
             </w:r>
           </w:p>
           <w:p>
@@ -27829,7 +27850,14 @@
                       <w:sz w:val="20"/>
                       <w:szCs w:val="20"/>
                     </w:rPr>
-                    <w:t>Step 3</w:t>
+                    <w:t xml:space="preserve">Step </w:t>
+                  </w:r>
+                  <w:r>
+                    <w:rPr>
+                      <w:sz w:val="20"/>
+                      <w:szCs w:val="20"/>
+                    </w:rPr>
+                    <w:t>4</w:t>
                   </w:r>
                 </w:p>
               </w:tc>
@@ -27872,7 +27900,35 @@
                       <w:sz w:val="20"/>
                       <w:szCs w:val="20"/>
                     </w:rPr>
-                    <w:t xml:space="preserve">Show a notification about the maximum available quantity. The customer may modify the quantity or abort the action. </w:t>
+                    <w:t xml:space="preserve">Show a notification about the maximum available quantity. The customer </w:t>
+                  </w:r>
+                  <w:r>
+                    <w:rPr>
+                      <w:sz w:val="20"/>
+                      <w:szCs w:val="20"/>
+                    </w:rPr>
+                    <w:t xml:space="preserve">should </w:t>
+                  </w:r>
+                  <w:r>
+                    <w:rPr>
+                      <w:sz w:val="20"/>
+                      <w:szCs w:val="20"/>
+                    </w:rPr>
+                    <w:t>modify the quantity</w:t>
+                  </w:r>
+                  <w:r>
+                    <w:rPr>
+                      <w:sz w:val="20"/>
+                      <w:szCs w:val="20"/>
+                    </w:rPr>
+                    <w:t>.</w:t>
+                  </w:r>
+                  <w:r>
+                    <w:rPr>
+                      <w:sz w:val="20"/>
+                      <w:szCs w:val="20"/>
+                    </w:rPr>
+                    <w:t xml:space="preserve"> </w:t>
                   </w:r>
                 </w:p>
               </w:tc>
@@ -27892,7 +27948,14 @@
                       <w:sz w:val="20"/>
                       <w:szCs w:val="20"/>
                     </w:rPr>
-                    <w:t>Step 4</w:t>
+                    <w:t xml:space="preserve">Step </w:t>
+                  </w:r>
+                  <w:r>
+                    <w:rPr>
+                      <w:sz w:val="20"/>
+                      <w:szCs w:val="20"/>
+                    </w:rPr>
+                    <w:t>2</w:t>
                   </w:r>
                 </w:p>
               </w:tc>
@@ -28677,18 +28740,613 @@
           </w:p>
           <w:p>
             <w:pPr>
+              <w:keepNext/>
+              <w:spacing w:after="120"/>
+              <w:rPr>
+                <w:b/>
+              </w:rPr>
+            </w:pPr>
+            <w:r>
+              <w:rPr>
+                <w:b/>
+              </w:rPr>
+              <w:t>Table A -</w:t>
+            </w:r>
+            <w:r>
+              <w:rPr>
+                <w:b/>
+              </w:rPr>
+              <w:t xml:space="preserve"> I</w:t>
+            </w:r>
+            <w:r>
+              <w:rPr>
+                <w:b/>
+              </w:rPr>
+              <w:t xml:space="preserve">nformation of </w:t>
+            </w:r>
+            <w:r>
+              <w:rPr>
+                <w:b/>
+              </w:rPr>
+              <w:t>Cart</w:t>
+            </w:r>
+            <w:r>
+              <w:rPr>
+                <w:b/>
+              </w:rPr>
+              <w:t>:</w:t>
+            </w:r>
+          </w:p>
+          <w:tbl>
+            <w:tblPr>
+              <w:tblW w:w="8395" w:type="dxa"/>
+              <w:tblBorders>
+                <w:top w:val="single" w:sz="4" w:space="0" w:color="000000"/>
+                <w:left w:val="single" w:sz="4" w:space="0" w:color="000000"/>
+                <w:bottom w:val="single" w:sz="4" w:space="0" w:color="000000"/>
+                <w:right w:val="single" w:sz="4" w:space="0" w:color="000000"/>
+                <w:insideH w:val="single" w:sz="4" w:space="0" w:color="000000"/>
+                <w:insideV w:val="single" w:sz="4" w:space="0" w:color="000000"/>
+              </w:tblBorders>
+              <w:tblLayout w:type="fixed"/>
+              <w:tblLook w:val="0400" w:firstRow="0" w:lastRow="0" w:firstColumn="0" w:lastColumn="0" w:noHBand="0" w:noVBand="1"/>
+            </w:tblPr>
+            <w:tblGrid>
+              <w:gridCol w:w="625"/>
+              <w:gridCol w:w="1350"/>
+              <w:gridCol w:w="2250"/>
+              <w:gridCol w:w="2700"/>
+              <w:gridCol w:w="1470"/>
+            </w:tblGrid>
+            <w:tr>
+              <w:tc>
+                <w:tcPr>
+                  <w:tcW w:w="625" w:type="dxa"/>
+                  <w:shd w:val="clear" w:color="auto" w:fill="D99594"/>
+                  <w:vAlign w:val="center"/>
+                </w:tcPr>
+                <w:p>
+                  <w:pPr>
+                    <w:widowControl w:val="0"/>
+                    <w:ind w:left="4"/>
+                    <w:jc w:val="center"/>
+                    <w:rPr>
+                      <w:b/>
+                      <w:sz w:val="20"/>
+                      <w:szCs w:val="20"/>
+                    </w:rPr>
+                  </w:pPr>
+                  <w:r>
+                    <w:rPr>
+                      <w:b/>
+                      <w:sz w:val="20"/>
+                      <w:szCs w:val="20"/>
+                    </w:rPr>
+                    <w:t>No</w:t>
+                  </w:r>
+                </w:p>
+              </w:tc>
+              <w:tc>
+                <w:tcPr>
+                  <w:tcW w:w="1350" w:type="dxa"/>
+                  <w:shd w:val="clear" w:color="auto" w:fill="D99594"/>
+                  <w:vAlign w:val="center"/>
+                </w:tcPr>
+                <w:p>
+                  <w:pPr>
+                    <w:widowControl w:val="0"/>
+                    <w:ind w:left="4"/>
+                    <w:jc w:val="center"/>
+                    <w:rPr>
+                      <w:b/>
+                      <w:sz w:val="20"/>
+                      <w:szCs w:val="20"/>
+                    </w:rPr>
+                  </w:pPr>
+                  <w:r>
+                    <w:rPr>
+                      <w:b/>
+                      <w:sz w:val="20"/>
+                      <w:szCs w:val="20"/>
+                    </w:rPr>
+                    <w:t>Data fields</w:t>
+                  </w:r>
+                </w:p>
+              </w:tc>
+              <w:tc>
+                <w:tcPr>
+                  <w:tcW w:w="2250" w:type="dxa"/>
+                  <w:shd w:val="clear" w:color="auto" w:fill="D99594"/>
+                  <w:vAlign w:val="center"/>
+                </w:tcPr>
+                <w:p>
+                  <w:pPr>
+                    <w:widowControl w:val="0"/>
+                    <w:ind w:left="4"/>
+                    <w:jc w:val="center"/>
+                    <w:rPr>
+                      <w:b/>
+                      <w:sz w:val="20"/>
+                      <w:szCs w:val="20"/>
+                    </w:rPr>
+                  </w:pPr>
+                  <w:r>
+                    <w:rPr>
+                      <w:b/>
+                      <w:sz w:val="20"/>
+                      <w:szCs w:val="20"/>
+                    </w:rPr>
+                    <w:t>Description</w:t>
+                  </w:r>
+                </w:p>
+              </w:tc>
+              <w:tc>
+                <w:tcPr>
+                  <w:tcW w:w="2700" w:type="dxa"/>
+                  <w:shd w:val="clear" w:color="auto" w:fill="D99594"/>
+                  <w:vAlign w:val="center"/>
+                </w:tcPr>
+                <w:p>
+                  <w:pPr>
+                    <w:widowControl w:val="0"/>
+                    <w:ind w:left="4"/>
+                    <w:jc w:val="center"/>
+                    <w:rPr>
+                      <w:b/>
+                      <w:sz w:val="20"/>
+                      <w:szCs w:val="20"/>
+                    </w:rPr>
+                  </w:pPr>
+                  <w:r>
+                    <w:rPr>
+                      <w:b/>
+                      <w:sz w:val="20"/>
+                      <w:szCs w:val="20"/>
+                    </w:rPr>
+                    <w:t>Display format</w:t>
+                  </w:r>
+                </w:p>
+              </w:tc>
+              <w:tc>
+                <w:tcPr>
+                  <w:tcW w:w="1470" w:type="dxa"/>
+                  <w:shd w:val="clear" w:color="auto" w:fill="D99594"/>
+                  <w:vAlign w:val="center"/>
+                </w:tcPr>
+                <w:p>
+                  <w:pPr>
+                    <w:widowControl w:val="0"/>
+                    <w:ind w:left="4"/>
+                    <w:jc w:val="center"/>
+                    <w:rPr>
+                      <w:b/>
+                      <w:sz w:val="20"/>
+                      <w:szCs w:val="20"/>
+                    </w:rPr>
+                  </w:pPr>
+                  <w:r>
+                    <w:rPr>
+                      <w:b/>
+                      <w:sz w:val="20"/>
+                      <w:szCs w:val="20"/>
+                    </w:rPr>
+                    <w:t>Example</w:t>
+                  </w:r>
+                </w:p>
+              </w:tc>
+            </w:tr>
+            <w:tr>
+              <w:tc>
+                <w:tcPr>
+                  <w:tcW w:w="625" w:type="dxa"/>
+                  <w:tcBorders>
+                    <w:top w:val="single" w:sz="6" w:space="0" w:color="000000"/>
+                    <w:left w:val="single" w:sz="6" w:space="0" w:color="000000"/>
+                    <w:bottom w:val="single" w:sz="6" w:space="0" w:color="000000"/>
+                    <w:right w:val="single" w:sz="6" w:space="0" w:color="000000"/>
+                  </w:tcBorders>
+                  <w:tcMar>
+                    <w:top w:w="0" w:type="dxa"/>
+                    <w:left w:w="0" w:type="dxa"/>
+                    <w:bottom w:w="0" w:type="dxa"/>
+                    <w:right w:w="0" w:type="dxa"/>
+                  </w:tcMar>
+                </w:tcPr>
+                <w:p>
+                  <w:pPr>
+                    <w:spacing w:line="240" w:lineRule="auto"/>
+                    <w:ind w:left="80"/>
+                    <w:jc w:val="left"/>
+                    <w:rPr>
+                      <w:sz w:val="20"/>
+                      <w:szCs w:val="20"/>
+                    </w:rPr>
+                  </w:pPr>
+                  <w:r>
+                    <w:rPr>
+                      <w:sz w:val="20"/>
+                      <w:szCs w:val="20"/>
+                    </w:rPr>
+                    <w:t>1.</w:t>
+                  </w:r>
+                </w:p>
+              </w:tc>
+              <w:tc>
+                <w:tcPr>
+                  <w:tcW w:w="1350" w:type="dxa"/>
+                  <w:tcBorders>
+                    <w:top w:val="single" w:sz="6" w:space="0" w:color="000000"/>
+                    <w:left w:val="nil"/>
+                    <w:bottom w:val="single" w:sz="6" w:space="0" w:color="000000"/>
+                    <w:right w:val="single" w:sz="6" w:space="0" w:color="000000"/>
+                  </w:tcBorders>
+                  <w:tcMar>
+                    <w:top w:w="0" w:type="dxa"/>
+                    <w:left w:w="0" w:type="dxa"/>
+                    <w:bottom w:w="0" w:type="dxa"/>
+                    <w:right w:w="0" w:type="dxa"/>
+                  </w:tcMar>
+                </w:tcPr>
+                <w:p>
+                  <w:pPr>
+                    <w:rPr>
+                      <w:sz w:val="20"/>
+                      <w:szCs w:val="20"/>
+                    </w:rPr>
+                  </w:pPr>
+                  <w:r>
+                    <w:rPr>
+                      <w:sz w:val="20"/>
+                      <w:szCs w:val="20"/>
+                    </w:rPr>
+                    <w:t xml:space="preserve"> Title</w:t>
+                  </w:r>
+                </w:p>
+              </w:tc>
+              <w:tc>
+                <w:tcPr>
+                  <w:tcW w:w="2250" w:type="dxa"/>
+                  <w:tcBorders>
+                    <w:top w:val="single" w:sz="6" w:space="0" w:color="000000"/>
+                    <w:left w:val="nil"/>
+                    <w:bottom w:val="single" w:sz="6" w:space="0" w:color="000000"/>
+                    <w:right w:val="single" w:sz="6" w:space="0" w:color="000000"/>
+                  </w:tcBorders>
+                  <w:tcMar>
+                    <w:top w:w="0" w:type="dxa"/>
+                    <w:left w:w="0" w:type="dxa"/>
+                    <w:bottom w:w="0" w:type="dxa"/>
+                    <w:right w:w="0" w:type="dxa"/>
+                  </w:tcMar>
+                </w:tcPr>
+                <w:p>
+                  <w:pPr>
+                    <w:jc w:val="left"/>
+                    <w:rPr>
+                      <w:sz w:val="20"/>
+                      <w:szCs w:val="20"/>
+                    </w:rPr>
+                  </w:pPr>
+                  <w:r>
+                    <w:rPr>
+                      <w:sz w:val="20"/>
+                      <w:szCs w:val="20"/>
+                    </w:rPr>
+                    <w:t xml:space="preserve">  Name of product</w:t>
+                  </w:r>
+                </w:p>
+              </w:tc>
+              <w:tc>
+                <w:tcPr>
+                  <w:tcW w:w="2700" w:type="dxa"/>
+                  <w:tcBorders>
+                    <w:top w:val="single" w:sz="6" w:space="0" w:color="000000"/>
+                    <w:left w:val="nil"/>
+                    <w:bottom w:val="single" w:sz="6" w:space="0" w:color="000000"/>
+                    <w:right w:val="single" w:sz="6" w:space="0" w:color="000000"/>
+                  </w:tcBorders>
+                  <w:tcMar>
+                    <w:top w:w="0" w:type="dxa"/>
+                    <w:left w:w="0" w:type="dxa"/>
+                    <w:bottom w:w="0" w:type="dxa"/>
+                    <w:right w:w="0" w:type="dxa"/>
+                  </w:tcMar>
+                </w:tcPr>
+                <w:p>
+                  <w:pPr>
+                    <w:rPr>
+                      <w:sz w:val="20"/>
+                      <w:szCs w:val="20"/>
+                    </w:rPr>
+                  </w:pPr>
+                  <w:r>
+                    <w:rPr>
+                      <w:sz w:val="20"/>
+                      <w:szCs w:val="20"/>
+                    </w:rPr>
+                    <w:t xml:space="preserve">  String</w:t>
+                  </w:r>
+                </w:p>
+              </w:tc>
+              <w:tc>
+                <w:tcPr>
+                  <w:tcW w:w="1470" w:type="dxa"/>
+                  <w:tcBorders>
+                    <w:top w:val="single" w:sz="6" w:space="0" w:color="000000"/>
+                    <w:left w:val="nil"/>
+                    <w:bottom w:val="single" w:sz="6" w:space="0" w:color="000000"/>
+                    <w:right w:val="single" w:sz="6" w:space="0" w:color="000000"/>
+                  </w:tcBorders>
+                  <w:tcMar>
+                    <w:top w:w="0" w:type="dxa"/>
+                    <w:left w:w="0" w:type="dxa"/>
+                    <w:bottom w:w="0" w:type="dxa"/>
+                    <w:right w:w="0" w:type="dxa"/>
+                  </w:tcMar>
+                </w:tcPr>
+                <w:p>
+                  <w:pPr>
+                    <w:ind w:left="160"/>
+                    <w:rPr>
+                      <w:sz w:val="20"/>
+                      <w:szCs w:val="20"/>
+                    </w:rPr>
+                  </w:pPr>
+                  <w:r>
+                    <w:rPr>
+                      <w:sz w:val="20"/>
+                      <w:szCs w:val="20"/>
+                    </w:rPr>
+                    <w:t>‘Star War’</w:t>
+                  </w:r>
+                </w:p>
+              </w:tc>
+            </w:tr>
+            <w:tr>
+              <w:tc>
+                <w:tcPr>
+                  <w:tcW w:w="625" w:type="dxa"/>
+                  <w:vAlign w:val="center"/>
+                </w:tcPr>
+                <w:p>
+                  <w:pPr>
+                    <w:spacing w:before="60" w:line="240" w:lineRule="auto"/>
+                    <w:jc w:val="left"/>
+                    <w:rPr>
+                      <w:sz w:val="20"/>
+                      <w:szCs w:val="20"/>
+                    </w:rPr>
+                  </w:pPr>
+                  <w:r>
+                    <w:rPr>
+                      <w:sz w:val="20"/>
+                      <w:szCs w:val="20"/>
+                    </w:rPr>
+                    <w:t>2</w:t>
+                  </w:r>
+                  <w:r>
+                    <w:rPr>
+                      <w:sz w:val="20"/>
+                      <w:szCs w:val="20"/>
+                    </w:rPr>
+                    <w:t>.</w:t>
+                  </w:r>
+                </w:p>
+              </w:tc>
+              <w:tc>
+                <w:tcPr>
+                  <w:tcW w:w="1350" w:type="dxa"/>
+                  <w:vAlign w:val="center"/>
+                </w:tcPr>
+                <w:p>
+                  <w:pPr>
+                    <w:rPr>
+                      <w:sz w:val="20"/>
+                      <w:szCs w:val="20"/>
+                    </w:rPr>
+                  </w:pPr>
+                  <w:r>
+                    <w:rPr>
+                      <w:sz w:val="20"/>
+                      <w:szCs w:val="20"/>
+                    </w:rPr>
+                    <w:t>Quantity</w:t>
+                  </w:r>
+                </w:p>
+              </w:tc>
+              <w:tc>
+                <w:tcPr>
+                  <w:tcW w:w="2250" w:type="dxa"/>
+                  <w:vAlign w:val="center"/>
+                </w:tcPr>
+                <w:p>
+                  <w:pPr>
+                    <w:jc w:val="left"/>
+                    <w:rPr>
+                      <w:sz w:val="20"/>
+                      <w:szCs w:val="20"/>
+                    </w:rPr>
+                  </w:pPr>
+                  <w:r>
+                    <w:rPr>
+                      <w:sz w:val="20"/>
+                      <w:szCs w:val="20"/>
+                    </w:rPr>
+                    <w:t>Quantity</w:t>
+                  </w:r>
+                  <w:r>
+                    <w:rPr>
+                      <w:sz w:val="20"/>
+                      <w:szCs w:val="20"/>
+                    </w:rPr>
+                    <w:t xml:space="preserve"> of product </w:t>
+                  </w:r>
+                </w:p>
+              </w:tc>
+              <w:tc>
+                <w:tcPr>
+                  <w:tcW w:w="2700" w:type="dxa"/>
+                  <w:vAlign w:val="center"/>
+                </w:tcPr>
+                <w:p>
+                  <w:pPr>
+                    <w:rPr>
+                      <w:sz w:val="20"/>
+                      <w:szCs w:val="20"/>
+                    </w:rPr>
+                  </w:pPr>
+                  <w:r>
+                    <w:rPr>
+                      <w:sz w:val="20"/>
+                      <w:szCs w:val="20"/>
+                    </w:rPr>
+                    <w:t>Non-negative integer</w:t>
+                  </w:r>
+                </w:p>
+              </w:tc>
+              <w:tc>
+                <w:tcPr>
+                  <w:tcW w:w="1470" w:type="dxa"/>
+                  <w:vAlign w:val="center"/>
+                </w:tcPr>
+                <w:p>
+                  <w:pPr>
+                    <w:rPr>
+                      <w:sz w:val="20"/>
+                      <w:szCs w:val="20"/>
+                    </w:rPr>
+                  </w:pPr>
+                  <w:r>
+                    <w:rPr>
+                      <w:sz w:val="20"/>
+                      <w:szCs w:val="20"/>
+                    </w:rPr>
+                    <w:t>5</w:t>
+                  </w:r>
+                </w:p>
+              </w:tc>
+            </w:tr>
+            <w:tr>
+              <w:tc>
+                <w:tcPr>
+                  <w:tcW w:w="625" w:type="dxa"/>
+                  <w:vAlign w:val="center"/>
+                </w:tcPr>
+                <w:p>
+                  <w:pPr>
+                    <w:spacing w:before="60" w:line="240" w:lineRule="auto"/>
+                    <w:jc w:val="left"/>
+                    <w:rPr>
+                      <w:sz w:val="20"/>
+                      <w:szCs w:val="20"/>
+                    </w:rPr>
+                  </w:pPr>
+                  <w:r>
+                    <w:rPr>
+                      <w:sz w:val="20"/>
+                      <w:szCs w:val="20"/>
+                    </w:rPr>
+                    <w:t>5.</w:t>
+                  </w:r>
+                </w:p>
+              </w:tc>
+              <w:tc>
+                <w:tcPr>
+                  <w:tcW w:w="1350" w:type="dxa"/>
+                  <w:vAlign w:val="center"/>
+                </w:tcPr>
+                <w:p>
+                  <w:pPr>
+                    <w:rPr>
+                      <w:sz w:val="20"/>
+                      <w:szCs w:val="20"/>
+                    </w:rPr>
+                  </w:pPr>
+                  <w:r>
+                    <w:rPr>
+                      <w:sz w:val="20"/>
+                      <w:szCs w:val="20"/>
+                    </w:rPr>
+                    <w:t>Price</w:t>
+                  </w:r>
+                </w:p>
+              </w:tc>
+              <w:tc>
+                <w:tcPr>
+                  <w:tcW w:w="2250" w:type="dxa"/>
+                  <w:vAlign w:val="center"/>
+                </w:tcPr>
+                <w:p>
+                  <w:pPr>
+                    <w:jc w:val="left"/>
+                    <w:rPr>
+                      <w:sz w:val="20"/>
+                      <w:szCs w:val="20"/>
+                    </w:rPr>
+                  </w:pPr>
+                  <w:r>
+                    <w:rPr>
+                      <w:sz w:val="20"/>
+                      <w:szCs w:val="20"/>
+                    </w:rPr>
+                    <w:t>Total price of  product</w:t>
+                  </w:r>
+                </w:p>
+              </w:tc>
+              <w:tc>
+                <w:tcPr>
+                  <w:tcW w:w="2700" w:type="dxa"/>
+                  <w:vAlign w:val="center"/>
+                </w:tcPr>
+                <w:p>
+                  <w:pPr>
+                    <w:rPr>
+                      <w:sz w:val="20"/>
+                      <w:szCs w:val="20"/>
+                    </w:rPr>
+                  </w:pPr>
+                  <w:r>
+                    <w:rPr>
+                      <w:sz w:val="20"/>
+                      <w:szCs w:val="20"/>
+                    </w:rPr>
+                    <w:t>Currency</w:t>
+                  </w:r>
+                </w:p>
+              </w:tc>
+              <w:tc>
+                <w:tcPr>
+                  <w:tcW w:w="1470" w:type="dxa"/>
+                  <w:vAlign w:val="center"/>
+                </w:tcPr>
+                <w:p>
+                  <w:pPr>
+                    <w:rPr>
+                      <w:sz w:val="20"/>
+                      <w:szCs w:val="20"/>
+                    </w:rPr>
+                  </w:pPr>
+                  <w:r>
+                    <w:rPr>
+                      <w:sz w:val="20"/>
+                      <w:szCs w:val="20"/>
+                    </w:rPr>
+                    <w:t>275,000 VND</w:t>
+                  </w:r>
+                </w:p>
+              </w:tc>
+            </w:tr>
+          </w:tbl>
+          <w:p>
+            <w:pPr>
               <w:spacing w:before="0" w:line="240" w:lineRule="auto"/>
-              <w:ind w:left="720"/>
+              <w:ind w:left="360"/>
               <w:rPr>
                 <w:b/>
+                <w:sz w:val="28"/>
+                <w:szCs w:val="28"/>
               </w:rPr>
             </w:pPr>
-            <w:r>
-              <w:rPr>
-                <w:b/>
-              </w:rPr>
-              <w:t>None</w:t>
-            </w:r>
           </w:p>
           <w:p>
             <w:pPr>
@@ -28718,7 +29376,10 @@
               <w:ind w:left="720"/>
             </w:pPr>
             <w:r>
-              <w:t>The cart is updated with the new list of products and quantities.</w:t>
+              <w:t>The cart displays the list of products and their quantities</w:t>
+            </w:r>
+            <w:r>
+              <w:t>.</w:t>
             </w:r>
           </w:p>
         </w:tc>
@@ -28998,6 +29659,33 @@
                 <w:sz w:val="26"/>
                 <w:szCs w:val="26"/>
               </w:rPr>
+              <w:t xml:space="preserve">The software </w:t>
+            </w:r>
+            <w:r>
+              <w:rPr>
+                <w:sz w:val="26"/>
+                <w:szCs w:val="26"/>
+              </w:rPr>
+              <w:t>processes the inventory of product</w:t>
+            </w:r>
+          </w:p>
+          <w:p>
+            <w:pPr>
+              <w:numPr>
+                <w:ilvl w:val="0"/>
+                <w:numId w:val="54"/>
+              </w:numPr>
+              <w:spacing w:before="0"/>
+              <w:rPr>
+                <w:sz w:val="22"/>
+                <w:szCs w:val="22"/>
+              </w:rPr>
+            </w:pPr>
+            <w:r>
+              <w:rPr>
+                <w:sz w:val="26"/>
+                <w:szCs w:val="26"/>
+              </w:rPr>
               <w:t>The software displays the updated cart with the new total price excluding VAT.</w:t>
             </w:r>
           </w:p>
@@ -29203,6 +29891,7 @@
                       <w:sz w:val="20"/>
                       <w:szCs w:val="20"/>
                     </w:rPr>
+                    <w:lastRenderedPageBreak/>
                     <w:t>1</w:t>
                   </w:r>
                   <w:r>
@@ -29230,7 +29919,14 @@
                       <w:sz w:val="20"/>
                       <w:szCs w:val="20"/>
                     </w:rPr>
-                    <w:t>Step 2</w:t>
+                    <w:t xml:space="preserve">Step </w:t>
+                  </w:r>
+                  <w:r>
+                    <w:rPr>
+                      <w:sz w:val="20"/>
+                      <w:szCs w:val="20"/>
+                    </w:rPr>
+                    <w:t>4</w:t>
                   </w:r>
                 </w:p>
               </w:tc>
@@ -29273,7 +29969,7 @@
                       <w:sz w:val="20"/>
                       <w:szCs w:val="20"/>
                     </w:rPr>
-                    <w:t>Display a message indicating the maximum available quantity. Customer can adjust the quantity or cancel the action.</w:t>
+                    <w:t>Display a message indicating the maximum available quantity.</w:t>
                   </w:r>
                 </w:p>
               </w:tc>
@@ -29293,7 +29989,7 @@
                       <w:sz w:val="20"/>
                       <w:szCs w:val="20"/>
                     </w:rPr>
-                    <w:t>Use case ends</w:t>
+                    <w:t>Step 2</w:t>
                   </w:r>
                 </w:p>
               </w:tc>
@@ -29319,7 +30015,6 @@
                       <w:sz w:val="20"/>
                       <w:szCs w:val="20"/>
                     </w:rPr>
-                    <w:lastRenderedPageBreak/>
                     <w:t>2</w:t>
                   </w:r>
                   <w:r>
@@ -29354,7 +30049,7 @@
                       <w:sz w:val="20"/>
                       <w:szCs w:val="20"/>
                     </w:rPr>
-                    <w:t>3</w:t>
+                    <w:t>4</w:t>
                   </w:r>
                 </w:p>
               </w:tc>
@@ -29375,7 +30070,21 @@
                       <w:sz w:val="20"/>
                       <w:szCs w:val="20"/>
                     </w:rPr>
-                    <w:t>Customer set the quantity to 0</w:t>
+                    <w:t>Customer set</w:t>
+                  </w:r>
+                  <w:r>
+                    <w:rPr>
+                      <w:sz w:val="20"/>
+                      <w:szCs w:val="20"/>
+                    </w:rPr>
+                    <w:t>s</w:t>
+                  </w:r>
+                  <w:r>
+                    <w:rPr>
+                      <w:sz w:val="20"/>
+                      <w:szCs w:val="20"/>
+                    </w:rPr>
+                    <w:t xml:space="preserve"> the quantity to 0</w:t>
                   </w:r>
                 </w:p>
               </w:tc>
@@ -29424,7 +30133,7 @@
                       <w:sz w:val="20"/>
                       <w:szCs w:val="20"/>
                     </w:rPr>
-                    <w:t>3</w:t>
+                    <w:t>4</w:t>
                   </w:r>
                 </w:p>
               </w:tc>
@@ -30065,6 +30774,7 @@
               <w:ind w:left="720"/>
             </w:pPr>
             <w:r>
+              <w:lastRenderedPageBreak/>
               <w:t>1. Product Manager is logged into the system</w:t>
             </w:r>
           </w:p>
@@ -30156,7 +30866,6 @@
               <w:spacing w:before="0"/>
             </w:pPr>
             <w:r>
-              <w:lastRenderedPageBreak/>
               <w:t>The software validates current inventory availability</w:t>
             </w:r>
           </w:p>
@@ -30783,6 +31492,7 @@
                       <w:sz w:val="20"/>
                       <w:szCs w:val="20"/>
                     </w:rPr>
+                    <w:lastRenderedPageBreak/>
                     <w:t>Product Manager is informed that the refund will be processed manually</w:t>
                   </w:r>
                 </w:p>
@@ -30803,6 +31513,7 @@
                       <w:sz w:val="20"/>
                       <w:szCs w:val="20"/>
                     </w:rPr>
+                    <w:lastRenderedPageBreak/>
                     <w:t>Use case ends</w:t>
                   </w:r>
                 </w:p>
@@ -30874,7 +31585,6 @@
               <w:rPr>
                 <w:b/>
               </w:rPr>
-              <w:lastRenderedPageBreak/>
               <w:t>Table A-Input data of  Process Pending Order</w:t>
             </w:r>
           </w:p>
@@ -32143,6 +32853,7 @@
               <w:ind w:left="720"/>
             </w:pPr>
             <w:r>
+              <w:lastRenderedPageBreak/>
               <w:t>1. Order status is updated to either "Approved" or "Rejected"</w:t>
             </w:r>
           </w:p>
@@ -33144,7 +33855,6 @@
               <w:rPr>
                 <w:b/>
               </w:rPr>
-              <w:lastRenderedPageBreak/>
               <w:t>Table B -Output data of UC Search Product:</w:t>
             </w:r>
           </w:p>
@@ -44306,6 +45016,7 @@
   <w:style w:type="paragraph" w:default="1" w:styleId="Normal">
     <w:name w:val="Normal"/>
     <w:qFormat/>
+    <w:rsid w:val="00A319E9"/>
   </w:style>
   <w:style w:type="paragraph" w:styleId="Heading1">
     <w:name w:val="heading 1"/>

</xml_diff>